<commit_message>
Use 35h annualized MIR hourly model
</commit_message>
<xml_diff>
--- a/public/downloads/dossier_mir_estatuto_marco.docx
+++ b/public/downloads/dossier_mir_estatuto_marco.docx
@@ -40,13 +40,13 @@
     <w:p>
       <w:pPr/>
       <w:r>
-        <w:t>La hipotesis de referencia son 80 horas mensuales de guardia: aproximadamente media jornada ordinaria adicional.</w:t>
+        <w:t>La hipótesis de referencia son 80 horas mensuales de guardia: más de media jornada ordinaria adicional si se usa una jornada de 35 h/semana.</w:t>
       </w:r>
     </w:p>
     <w:p>
       <w:pPr/>
       <w:r>
-        <w:t>Con esa carga, el R1 medio mostrado como 2.087 euros netos/mes equivale a unas 242,5 horas mensuales y queda en torno a 8,6 euros netos/hora.</w:t>
+        <w:t>Con esa carga, el R1 medio mostrado como 2.087 euros netos/mes equivale a unas 231,7 horas mensuales y queda en torno a 9,0 euros netos/hora. Si el cómputo aplicable es 37,5 h/semana, baja a 8,6 euros netos/hora.</w:t>
       </w:r>
     </w:p>
     <w:p>
@@ -82,16 +82,7 @@
             <w:shd w:fill="17324D"/>
           </w:tcPr>
           <w:p>
-            <w:pPr>
-              <w:spacing w:after="40"/>
-            </w:pPr>
             <w:r>
-              <w:rPr>
-                <w:rFonts w:ascii="Arial" w:hAnsi="Arial"/>
-                <w:b/>
-                <w:color w:val="FFFFFF"/>
-                <w:sz w:val="18"/>
-              </w:rPr>
               <w:t>Concepto</w:t>
             </w:r>
           </w:p>
@@ -103,16 +94,7 @@
             <w:shd w:fill="17324D"/>
           </w:tcPr>
           <w:p>
-            <w:pPr>
-              <w:spacing w:after="40"/>
-            </w:pPr>
             <w:r>
-              <w:rPr>
-                <w:rFonts w:ascii="Arial" w:hAnsi="Arial"/>
-                <w:b/>
-                <w:color w:val="FFFFFF"/>
-                <w:sz w:val="18"/>
-              </w:rPr>
               <w:t>R1 media</w:t>
             </w:r>
           </w:p>
@@ -124,16 +106,7 @@
             <w:shd w:fill="17324D"/>
           </w:tcPr>
           <w:p>
-            <w:pPr>
-              <w:spacing w:after="40"/>
-            </w:pPr>
             <w:r>
-              <w:rPr>
-                <w:rFonts w:ascii="Arial" w:hAnsi="Arial"/>
-                <w:b/>
-                <w:color w:val="FFFFFF"/>
-                <w:sz w:val="18"/>
-              </w:rPr>
               <w:t>R5 media</w:t>
             </w:r>
           </w:p>
@@ -146,14 +119,7 @@
             <w:vAlign w:val="center"/>
           </w:tcPr>
           <w:p>
-            <w:pPr>
-              <w:spacing w:after="40"/>
-            </w:pPr>
             <w:r>
-              <w:rPr>
-                <w:rFonts w:ascii="Arial" w:hAnsi="Arial"/>
-                <w:sz w:val="18"/>
-              </w:rPr>
               <w:t>Bruto mensual sin guardias</w:t>
             </w:r>
           </w:p>
@@ -164,14 +130,7 @@
             <w:vAlign w:val="center"/>
           </w:tcPr>
           <w:p>
-            <w:pPr>
-              <w:spacing w:after="40"/>
-            </w:pPr>
             <w:r>
-              <w:rPr>
-                <w:rFonts w:ascii="Arial" w:hAnsi="Arial"/>
-                <w:sz w:val="18"/>
-              </w:rPr>
               <w:t>1.447 €</w:t>
             </w:r>
           </w:p>
@@ -182,14 +141,7 @@
             <w:vAlign w:val="center"/>
           </w:tcPr>
           <w:p>
-            <w:pPr>
-              <w:spacing w:after="40"/>
-            </w:pPr>
             <w:r>
-              <w:rPr>
-                <w:rFonts w:ascii="Arial" w:hAnsi="Arial"/>
-                <w:sz w:val="18"/>
-              </w:rPr>
               <w:t>1.973 €</w:t>
             </w:r>
           </w:p>
@@ -202,14 +154,7 @@
             <w:vAlign w:val="center"/>
           </w:tcPr>
           <w:p>
-            <w:pPr>
-              <w:spacing w:after="40"/>
-            </w:pPr>
             <w:r>
-              <w:rPr>
-                <w:rFonts w:ascii="Arial" w:hAnsi="Arial"/>
-                <w:sz w:val="18"/>
-              </w:rPr>
               <w:t>Neto mensual cartel/80 h</w:t>
             </w:r>
           </w:p>
@@ -220,14 +165,7 @@
             <w:vAlign w:val="center"/>
           </w:tcPr>
           <w:p>
-            <w:pPr>
-              <w:spacing w:after="40"/>
-            </w:pPr>
             <w:r>
-              <w:rPr>
-                <w:rFonts w:ascii="Arial" w:hAnsi="Arial"/>
-                <w:sz w:val="18"/>
-              </w:rPr>
               <w:t>2.087 €</w:t>
             </w:r>
           </w:p>
@@ -238,14 +176,7 @@
             <w:vAlign w:val="center"/>
           </w:tcPr>
           <w:p>
-            <w:pPr>
-              <w:spacing w:after="40"/>
-            </w:pPr>
             <w:r>
-              <w:rPr>
-                <w:rFonts w:ascii="Arial" w:hAnsi="Arial"/>
-                <w:sz w:val="18"/>
-              </w:rPr>
               <w:t>2.758 €</w:t>
             </w:r>
           </w:p>
@@ -258,14 +189,7 @@
             <w:vAlign w:val="center"/>
           </w:tcPr>
           <w:p>
-            <w:pPr>
-              <w:spacing w:after="40"/>
-            </w:pPr>
             <w:r>
-              <w:rPr>
-                <w:rFonts w:ascii="Arial" w:hAnsi="Arial"/>
-                <w:sz w:val="18"/>
-              </w:rPr>
               <w:t>Bruto mensual cartel/80 h</w:t>
             </w:r>
           </w:p>
@@ -276,14 +200,7 @@
             <w:vAlign w:val="center"/>
           </w:tcPr>
           <w:p>
-            <w:pPr>
-              <w:spacing w:after="40"/>
-            </w:pPr>
             <w:r>
-              <w:rPr>
-                <w:rFonts w:ascii="Arial" w:hAnsi="Arial"/>
-                <w:sz w:val="18"/>
-              </w:rPr>
               <w:t>2.806 €</w:t>
             </w:r>
           </w:p>
@@ -294,14 +211,7 @@
             <w:vAlign w:val="center"/>
           </w:tcPr>
           <w:p>
-            <w:pPr>
-              <w:spacing w:after="40"/>
-            </w:pPr>
             <w:r>
-              <w:rPr>
-                <w:rFonts w:ascii="Arial" w:hAnsi="Arial"/>
-                <w:sz w:val="18"/>
-              </w:rPr>
               <w:t>3.929 €</w:t>
             </w:r>
           </w:p>
@@ -314,14 +224,7 @@
             <w:vAlign w:val="center"/>
           </w:tcPr>
           <w:p>
-            <w:pPr>
-              <w:spacing w:after="40"/>
-            </w:pPr>
             <w:r>
-              <w:rPr>
-                <w:rFonts w:ascii="Arial" w:hAnsi="Arial"/>
-                <w:sz w:val="18"/>
-              </w:rPr>
               <w:t>Guardias dentro del bruto total</w:t>
             </w:r>
           </w:p>
@@ -332,15 +235,8 @@
             <w:vAlign w:val="center"/>
           </w:tcPr>
           <w:p>
-            <w:pPr>
-              <w:spacing w:after="40"/>
-            </w:pPr>
             <w:r>
-              <w:rPr>
-                <w:rFonts w:ascii="Arial" w:hAnsi="Arial"/>
-                <w:sz w:val="18"/>
-              </w:rPr>
-              <w:t>48.4%</w:t>
+              <w:t>48,4 %</w:t>
             </w:r>
           </w:p>
         </w:tc>
@@ -350,15 +246,8 @@
             <w:vAlign w:val="center"/>
           </w:tcPr>
           <w:p>
-            <w:pPr>
-              <w:spacing w:after="40"/>
-            </w:pPr>
             <w:r>
-              <w:rPr>
-                <w:rFonts w:ascii="Arial" w:hAnsi="Arial"/>
-                <w:sz w:val="18"/>
-              </w:rPr>
-              <w:t>49.8%</w:t>
+              <w:t>49,8 %</w:t>
             </w:r>
           </w:p>
         </w:tc>
@@ -370,15 +259,8 @@
             <w:vAlign w:val="center"/>
           </w:tcPr>
           <w:p>
-            <w:pPr>
-              <w:spacing w:after="40"/>
-            </w:pPr>
             <w:r>
-              <w:rPr>
-                <w:rFonts w:ascii="Arial" w:hAnsi="Arial"/>
-                <w:sz w:val="18"/>
-              </w:rPr>
-              <w:t>Horas mensuales reales</w:t>
+              <w:t>Horas ordinarias usadas</w:t>
             </w:r>
           </w:p>
         </w:tc>
@@ -388,15 +270,8 @@
             <w:vAlign w:val="center"/>
           </w:tcPr>
           <w:p>
-            <w:pPr>
-              <w:spacing w:after="40"/>
-            </w:pPr>
             <w:r>
-              <w:rPr>
-                <w:rFonts w:ascii="Arial" w:hAnsi="Arial"/>
-                <w:sz w:val="18"/>
-              </w:rPr>
-              <w:t>242.5 h</w:t>
+              <w:t>151,7 h</w:t>
             </w:r>
           </w:p>
         </w:tc>
@@ -406,15 +281,8 @@
             <w:vAlign w:val="center"/>
           </w:tcPr>
           <w:p>
-            <w:pPr>
-              <w:spacing w:after="40"/>
-            </w:pPr>
             <w:r>
-              <w:rPr>
-                <w:rFonts w:ascii="Arial" w:hAnsi="Arial"/>
-                <w:sz w:val="18"/>
-              </w:rPr>
-              <w:t>242.5 h</w:t>
+              <w:t>151,7 h</w:t>
             </w:r>
           </w:p>
         </w:tc>
@@ -426,15 +294,8 @@
             <w:vAlign w:val="center"/>
           </w:tcPr>
           <w:p>
-            <w:pPr>
-              <w:spacing w:after="40"/>
-            </w:pPr>
             <w:r>
-              <w:rPr>
-                <w:rFonts w:ascii="Arial" w:hAnsi="Arial"/>
-                <w:sz w:val="18"/>
-              </w:rPr>
-              <w:t>Neto por hora real</w:t>
+              <w:t>Guardias incluidas en el cartel</w:t>
             </w:r>
           </w:p>
         </w:tc>
@@ -444,15 +305,8 @@
             <w:vAlign w:val="center"/>
           </w:tcPr>
           <w:p>
-            <w:pPr>
-              <w:spacing w:after="40"/>
-            </w:pPr>
             <w:r>
-              <w:rPr>
-                <w:rFonts w:ascii="Arial" w:hAnsi="Arial"/>
-                <w:sz w:val="18"/>
-              </w:rPr>
-              <w:t>8.61 €/h</w:t>
+              <w:t>80 h</w:t>
             </w:r>
           </w:p>
         </w:tc>
@@ -462,15 +316,104 @@
             <w:vAlign w:val="center"/>
           </w:tcPr>
           <w:p>
-            <w:pPr>
-              <w:spacing w:after="40"/>
-            </w:pPr>
             <w:r>
-              <w:rPr>
-                <w:rFonts w:ascii="Arial" w:hAnsi="Arial"/>
-                <w:sz w:val="18"/>
-              </w:rPr>
-              <w:t>11.37 €/h</w:t>
+              <w:t>80 h</w:t>
+            </w:r>
+          </w:p>
+        </w:tc>
+      </w:tr>
+      <w:tr>
+        <w:tc>
+          <w:tcPr>
+            <w:tcW w:type="dxa" w:w="3360"/>
+          </w:tcPr>
+          <w:p>
+            <w:r>
+              <w:t>Horas mensuales reales</w:t>
+            </w:r>
+          </w:p>
+        </w:tc>
+        <w:tc>
+          <w:tcPr>
+            <w:tcW w:type="dxa" w:w="3360"/>
+          </w:tcPr>
+          <w:p>
+            <w:r>
+              <w:t>231,7 h</w:t>
+            </w:r>
+          </w:p>
+        </w:tc>
+        <w:tc>
+          <w:tcPr>
+            <w:tcW w:type="dxa" w:w="3360"/>
+          </w:tcPr>
+          <w:p>
+            <w:r>
+              <w:t>231,7 h</w:t>
+            </w:r>
+          </w:p>
+        </w:tc>
+      </w:tr>
+      <w:tr>
+        <w:tc>
+          <w:tcPr>
+            <w:tcW w:type="dxa" w:w="3360"/>
+          </w:tcPr>
+          <w:p>
+            <w:r>
+              <w:t>Neto por hora real</w:t>
+            </w:r>
+          </w:p>
+        </w:tc>
+        <w:tc>
+          <w:tcPr>
+            <w:tcW w:type="dxa" w:w="3360"/>
+          </w:tcPr>
+          <w:p>
+            <w:r>
+              <w:t>9,01 €/h</w:t>
+            </w:r>
+          </w:p>
+        </w:tc>
+        <w:tc>
+          <w:tcPr>
+            <w:tcW w:type="dxa" w:w="3360"/>
+          </w:tcPr>
+          <w:p>
+            <w:r>
+              <w:t>11,91 €/h</w:t>
+            </w:r>
+          </w:p>
+        </w:tc>
+      </w:tr>
+      <w:tr>
+        <w:tc>
+          <w:tcPr>
+            <w:tcW w:type="dxa" w:w="3360"/>
+          </w:tcPr>
+          <w:p>
+            <w:r>
+              <w:t>Neto por hora si aplica 37,5 h/semana</w:t>
+            </w:r>
+          </w:p>
+        </w:tc>
+        <w:tc>
+          <w:tcPr>
+            <w:tcW w:type="dxa" w:w="3360"/>
+          </w:tcPr>
+          <w:p>
+            <w:r>
+              <w:t>8,61 €/h</w:t>
+            </w:r>
+          </w:p>
+        </w:tc>
+        <w:tc>
+          <w:tcPr>
+            <w:tcW w:type="dxa" w:w="3360"/>
+          </w:tcPr>
+          <w:p>
+            <w:r>
+              <w:t>11,37 €/h</w:t>
             </w:r>
           </w:p>
         </w:tc>
@@ -541,7 +484,7 @@
         <w:pStyle w:val="ListBullet"/>
       </w:pPr>
       <w:r>
-        <w:t>Convertir siempre a euros/hora con horas reales: jornada ordinaria mensual + guardias + tiempo formativo no registrado.</w:t>
+        <w:t>Convertir siempre a euros/hora con horas reales: jornada ordinaria mensual anualizada + guardias. La formación no registrada existe por encima y no se suma al divisor principal.</w:t>
       </w:r>
     </w:p>
     <w:p>

</xml_diff>

<commit_message>
Add resident training workload note
</commit_message>
<xml_diff>
--- a/public/downloads/dossier_mir_estatuto_marco.docx
+++ b/public/downloads/dossier_mir_estatuto_marco.docx
@@ -21,6 +21,11 @@
       </w:pPr>
       <w:r>
         <w:t>Fecha: 6 de mayo de 2026. Documento de trabajo con datos contrastados y cálculos reproducibles.</w:t>
+      </w:r>
+    </w:p>
+    <w:p>
+      <w:r>
+        <w:t>Nota metodológica: no se añaden horas estimadas de estudio ni formación al cálculo principal. Eso no significa que no existan. Muchos residentes dedican buena parte de sus tardes a estudiar, preparar sesiones, realizar postgrados o másteres, doctorado, congresos, investigación y publicaciones. Ese trabajo formativo suele no estar retribuido y, en no pocos casos, implica costes directos para el propio residente.</w:t>
       </w:r>
     </w:p>
     <w:p>
@@ -484,7 +489,7 @@
         <w:pStyle w:val="ListBullet"/>
       </w:pPr>
       <w:r>
-        <w:t>Convertir siempre a euros/hora con horas reales: jornada ordinaria mensual anualizada + guardias. La formación no registrada existe por encima y no se suma al divisor principal.</w:t>
+        <w:t>Convertir siempre a euros/hora con horas reales: jornada ordinaria mensual anualizada + guardias. Estudio, sesiones, postgrados, másteres, doctorado, congresos, investigación y publicaciones existen por encima y no se suman al divisor principal.</w:t>
       </w:r>
     </w:p>
     <w:p>

</xml_diff>